<commit_message>
docs(PDF): Actualizada informacion sobre las funciones del proyecto
</commit_message>
<xml_diff>
--- a/docs/FAT.docx
+++ b/docs/FAT.docx
@@ -11,43 +11,63 @@
           <w:szCs w:val="24"/>
         </w:rPr>
       </w:pPr>
-    </w:p>
-    <w:p>
-      <w:pPr>
-        <w:spacing w:line="480" w:lineRule="auto"/>
-        <w:jc w:val="center"/>
-        <w:rPr>
-          <w:rFonts w:asciiTheme="minorHAnsi" w:hAnsiTheme="minorHAnsi" w:cstheme="minorHAnsi"/>
-          <w:color w:val="073763"/>
-          <w:sz w:val="24"/>
-          <w:szCs w:val="24"/>
-        </w:rPr>
-      </w:pPr>
-      <w:r>
-        <w:rPr>
-          <w:rFonts w:asciiTheme="minorHAnsi" w:hAnsiTheme="minorHAnsi" w:cstheme="minorHAnsi"/>
-          <w:color w:val="073763"/>
-          <w:sz w:val="24"/>
-          <w:szCs w:val="24"/>
-        </w:rPr>
-        <w:t xml:space="preserve">Bubo </w:t>
-      </w:r>
-      <w:proofErr w:type="spellStart"/>
-      <w:r>
-        <w:rPr>
-          <w:rFonts w:asciiTheme="minorHAnsi" w:hAnsiTheme="minorHAnsi" w:cstheme="minorHAnsi"/>
-          <w:color w:val="073763"/>
-          <w:sz w:val="24"/>
-          <w:szCs w:val="24"/>
-        </w:rPr>
-        <w:t>Bubo</w:t>
-      </w:r>
-      <w:proofErr w:type="spellEnd"/>
-    </w:p>
-    <w:p>
-      <w:pPr>
-        <w:spacing w:line="480" w:lineRule="auto"/>
-        <w:jc w:val="center"/>
+      <w:r>
+        <w:rPr>
+          <w:noProof/>
+        </w:rPr>
+        <w:drawing>
+          <wp:inline distT="0" distB="0" distL="0" distR="0" wp14:anchorId="6328FDD0" wp14:editId="1E4D99C3">
+            <wp:extent cx="5731510" cy="7642225"/>
+            <wp:effectExtent l="0" t="0" r="0" b="0"/>
+            <wp:docPr id="3" name="Imagen 3"/>
+            <wp:cNvGraphicFramePr>
+              <a:graphicFrameLocks xmlns:a="http://schemas.openxmlformats.org/drawingml/2006/main" noChangeAspect="1"/>
+            </wp:cNvGraphicFramePr>
+            <a:graphic xmlns:a="http://schemas.openxmlformats.org/drawingml/2006/main">
+              <a:graphicData uri="http://schemas.openxmlformats.org/drawingml/2006/picture">
+                <pic:pic xmlns:pic="http://schemas.openxmlformats.org/drawingml/2006/picture">
+                  <pic:nvPicPr>
+                    <pic:cNvPr id="0" name="Picture 1"/>
+                    <pic:cNvPicPr>
+                      <a:picLocks noChangeAspect="1" noChangeArrowheads="1"/>
+                    </pic:cNvPicPr>
+                  </pic:nvPicPr>
+                  <pic:blipFill>
+                    <a:blip r:embed="rId9" cstate="print">
+                      <a:extLst>
+                        <a:ext uri="{28A0092B-C50C-407E-A947-70E740481C1C}">
+                          <a14:useLocalDpi xmlns:a14="http://schemas.microsoft.com/office/drawing/2010/main" val="0"/>
+                        </a:ext>
+                      </a:extLst>
+                    </a:blip>
+                    <a:srcRect/>
+                    <a:stretch>
+                      <a:fillRect/>
+                    </a:stretch>
+                  </pic:blipFill>
+                  <pic:spPr bwMode="auto">
+                    <a:xfrm>
+                      <a:off x="0" y="0"/>
+                      <a:ext cx="5731510" cy="7642225"/>
+                    </a:xfrm>
+                    <a:prstGeom prst="rect">
+                      <a:avLst/>
+                    </a:prstGeom>
+                    <a:noFill/>
+                    <a:ln>
+                      <a:noFill/>
+                    </a:ln>
+                  </pic:spPr>
+                </pic:pic>
+              </a:graphicData>
+            </a:graphic>
+          </wp:inline>
+        </w:drawing>
+      </w:r>
+    </w:p>
+    <w:p>
+      <w:pPr>
+        <w:spacing w:line="480" w:lineRule="auto"/>
         <w:rPr>
           <w:rFonts w:asciiTheme="minorHAnsi" w:hAnsiTheme="minorHAnsi" w:cstheme="minorHAnsi"/>
           <w:i/>
@@ -56,75 +76,6 @@
           <w:szCs w:val="24"/>
         </w:rPr>
       </w:pPr>
-      <w:r>
-        <w:rPr>
-          <w:rFonts w:asciiTheme="minorHAnsi" w:hAnsiTheme="minorHAnsi" w:cstheme="minorHAnsi"/>
-          <w:i/>
-          <w:iCs/>
-          <w:color w:val="073763"/>
-          <w:sz w:val="24"/>
-          <w:szCs w:val="24"/>
-        </w:rPr>
-        <w:t>Bubo</w:t>
-      </w:r>
-      <w:r>
-        <w:rPr>
-          <w:rFonts w:asciiTheme="minorHAnsi" w:hAnsiTheme="minorHAnsi" w:cstheme="minorHAnsi"/>
-          <w:i/>
-          <w:iCs/>
-          <w:sz w:val="24"/>
-          <w:szCs w:val="24"/>
-        </w:rPr>
-        <w:t>²</w:t>
-      </w:r>
-    </w:p>
-    <w:p>
-      <w:pPr>
-        <w:spacing w:line="480" w:lineRule="auto"/>
-        <w:ind w:firstLineChars="127" w:firstLine="305"/>
-        <w:rPr>
-          <w:rFonts w:asciiTheme="minorHAnsi" w:hAnsiTheme="minorHAnsi" w:cstheme="minorHAnsi"/>
-          <w:i/>
-          <w:iCs/>
-          <w:sz w:val="24"/>
-          <w:szCs w:val="24"/>
-        </w:rPr>
-      </w:pPr>
-      <w:r>
-        <w:rPr>
-          <w:rFonts w:asciiTheme="minorHAnsi" w:hAnsiTheme="minorHAnsi" w:cstheme="minorHAnsi"/>
-          <w:i/>
-          <w:iCs/>
-          <w:noProof/>
-          <w:sz w:val="24"/>
-          <w:szCs w:val="24"/>
-        </w:rPr>
-        <w:t>PORTADA</w:t>
-      </w:r>
-    </w:p>
-    <w:p>
-      <w:pPr>
-        <w:spacing w:line="480" w:lineRule="auto"/>
-        <w:rPr>
-          <w:rFonts w:asciiTheme="minorHAnsi" w:hAnsiTheme="minorHAnsi" w:cstheme="minorHAnsi"/>
-          <w:i/>
-          <w:iCs/>
-          <w:sz w:val="24"/>
-          <w:szCs w:val="24"/>
-        </w:rPr>
-      </w:pPr>
-    </w:p>
-    <w:p>
-      <w:pPr>
-        <w:spacing w:line="480" w:lineRule="auto"/>
-        <w:rPr>
-          <w:rFonts w:asciiTheme="minorHAnsi" w:hAnsiTheme="minorHAnsi" w:cstheme="minorHAnsi"/>
-          <w:i/>
-          <w:iCs/>
-          <w:sz w:val="24"/>
-          <w:szCs w:val="24"/>
-        </w:rPr>
-      </w:pPr>
     </w:p>
     <w:p>
       <w:pPr>
@@ -182,34 +133,6 @@
           <w:szCs w:val="24"/>
         </w:rPr>
         <w:t>Curso: Séptimo “C” Informática</w:t>
-      </w:r>
-    </w:p>
-    <w:p>
-      <w:pPr>
-        <w:spacing w:line="480" w:lineRule="auto"/>
-        <w:ind w:firstLineChars="127" w:firstLine="305"/>
-        <w:jc w:val="left"/>
-        <w:rPr>
-          <w:rFonts w:asciiTheme="minorHAnsi" w:hAnsiTheme="minorHAnsi" w:cstheme="minorHAnsi"/>
-          <w:sz w:val="24"/>
-          <w:szCs w:val="24"/>
-        </w:rPr>
-        <w:sectPr>
-          <w:headerReference w:type="default" r:id="rId9"/>
-          <w:footerReference w:type="default" r:id="rId10"/>
-          <w:pgSz w:w="11906" w:h="16838"/>
-          <w:pgMar w:top="1440" w:right="1440" w:bottom="1440" w:left="1440" w:header="720" w:footer="720" w:gutter="0"/>
-          <w:cols w:space="720"/>
-          <w:docGrid w:linePitch="360"/>
-        </w:sectPr>
-      </w:pPr>
-      <w:r>
-        <w:rPr>
-          <w:rFonts w:asciiTheme="minorHAnsi" w:hAnsiTheme="minorHAnsi" w:cstheme="minorHAnsi"/>
-          <w:sz w:val="24"/>
-          <w:szCs w:val="24"/>
-        </w:rPr>
-        <w:t>Fecha entrega:</w:t>
       </w:r>
     </w:p>
     <w:p>
@@ -1115,6 +1038,7 @@
               <w:kern w:val="0"/>
               <w:sz w:val="24"/>
               <w:szCs w:val="24"/>
+              <w:highlight w:val="yellow"/>
               <w:lang w:eastAsia="es-AR"/>
             </w:rPr>
           </w:pPr>
@@ -1127,6 +1051,7 @@
                 <w:noProof/>
                 <w:sz w:val="24"/>
                 <w:szCs w:val="24"/>
+                <w:highlight w:val="yellow"/>
               </w:rPr>
               <w:t>ETAPA 4: Mejora del proyecto y refactorización</w:t>
             </w:r>
@@ -1137,6 +1062,7 @@
                 <w:webHidden/>
                 <w:sz w:val="24"/>
                 <w:szCs w:val="24"/>
+                <w:highlight w:val="yellow"/>
               </w:rPr>
               <w:tab/>
             </w:r>
@@ -1147,6 +1073,7 @@
                 <w:webHidden/>
                 <w:sz w:val="24"/>
                 <w:szCs w:val="24"/>
+                <w:highlight w:val="yellow"/>
               </w:rPr>
               <w:fldChar w:fldCharType="begin"/>
             </w:r>
@@ -1157,6 +1084,7 @@
                 <w:webHidden/>
                 <w:sz w:val="24"/>
                 <w:szCs w:val="24"/>
+                <w:highlight w:val="yellow"/>
               </w:rPr>
               <w:instrText xml:space="preserve"> PAGEREF _Toc238628405 \h </w:instrText>
             </w:r>
@@ -1167,6 +1095,7 @@
                 <w:webHidden/>
                 <w:sz w:val="24"/>
                 <w:szCs w:val="24"/>
+                <w:highlight w:val="yellow"/>
               </w:rPr>
             </w:r>
             <w:r>
@@ -1176,6 +1105,7 @@
                 <w:webHidden/>
                 <w:sz w:val="24"/>
                 <w:szCs w:val="24"/>
+                <w:highlight w:val="yellow"/>
               </w:rPr>
               <w:fldChar w:fldCharType="separate"/>
             </w:r>
@@ -1186,6 +1116,7 @@
                 <w:webHidden/>
                 <w:sz w:val="24"/>
                 <w:szCs w:val="24"/>
+                <w:highlight w:val="yellow"/>
               </w:rPr>
               <w:t>14</w:t>
             </w:r>
@@ -1196,6 +1127,7 @@
                 <w:webHidden/>
                 <w:sz w:val="24"/>
                 <w:szCs w:val="24"/>
+                <w:highlight w:val="yellow"/>
               </w:rPr>
               <w:fldChar w:fldCharType="end"/>
             </w:r>
@@ -1214,6 +1146,7 @@
               <w:kern w:val="0"/>
               <w:sz w:val="24"/>
               <w:szCs w:val="24"/>
+              <w:highlight w:val="yellow"/>
               <w:lang w:eastAsia="es-AR"/>
             </w:rPr>
           </w:pPr>
@@ -1226,6 +1159,7 @@
                 <w:noProof/>
                 <w:sz w:val="24"/>
                 <w:szCs w:val="24"/>
+                <w:highlight w:val="yellow"/>
               </w:rPr>
               <w:t>ETAPA 5: Difusión y manual del usuario</w:t>
             </w:r>
@@ -1236,6 +1170,7 @@
                 <w:webHidden/>
                 <w:sz w:val="24"/>
                 <w:szCs w:val="24"/>
+                <w:highlight w:val="yellow"/>
               </w:rPr>
               <w:tab/>
             </w:r>
@@ -1246,6 +1181,7 @@
                 <w:webHidden/>
                 <w:sz w:val="24"/>
                 <w:szCs w:val="24"/>
+                <w:highlight w:val="yellow"/>
               </w:rPr>
               <w:fldChar w:fldCharType="begin"/>
             </w:r>
@@ -1256,6 +1192,7 @@
                 <w:webHidden/>
                 <w:sz w:val="24"/>
                 <w:szCs w:val="24"/>
+                <w:highlight w:val="yellow"/>
               </w:rPr>
               <w:instrText xml:space="preserve"> PAGEREF _Toc238628406 \h </w:instrText>
             </w:r>
@@ -1266,6 +1203,7 @@
                 <w:webHidden/>
                 <w:sz w:val="24"/>
                 <w:szCs w:val="24"/>
+                <w:highlight w:val="yellow"/>
               </w:rPr>
             </w:r>
             <w:r>
@@ -1275,6 +1213,7 @@
                 <w:webHidden/>
                 <w:sz w:val="24"/>
                 <w:szCs w:val="24"/>
+                <w:highlight w:val="yellow"/>
               </w:rPr>
               <w:fldChar w:fldCharType="separate"/>
             </w:r>
@@ -1285,6 +1224,7 @@
                 <w:webHidden/>
                 <w:sz w:val="24"/>
                 <w:szCs w:val="24"/>
+                <w:highlight w:val="yellow"/>
               </w:rPr>
               <w:t>14</w:t>
             </w:r>
@@ -1295,6 +1235,7 @@
                 <w:webHidden/>
                 <w:sz w:val="24"/>
                 <w:szCs w:val="24"/>
+                <w:highlight w:val="yellow"/>
               </w:rPr>
               <w:fldChar w:fldCharType="end"/>
             </w:r>
@@ -1313,6 +1254,7 @@
               <w:kern w:val="0"/>
               <w:sz w:val="24"/>
               <w:szCs w:val="24"/>
+              <w:highlight w:val="yellow"/>
               <w:lang w:eastAsia="es-AR"/>
             </w:rPr>
           </w:pPr>
@@ -1325,6 +1267,7 @@
                 <w:noProof/>
                 <w:sz w:val="24"/>
                 <w:szCs w:val="24"/>
+                <w:highlight w:val="yellow"/>
               </w:rPr>
               <w:t>ETAPA 6: Pruebas, testeos y resolución de errores</w:t>
             </w:r>
@@ -1335,6 +1278,7 @@
                 <w:webHidden/>
                 <w:sz w:val="24"/>
                 <w:szCs w:val="24"/>
+                <w:highlight w:val="yellow"/>
               </w:rPr>
               <w:tab/>
             </w:r>
@@ -1345,6 +1289,7 @@
                 <w:webHidden/>
                 <w:sz w:val="24"/>
                 <w:szCs w:val="24"/>
+                <w:highlight w:val="yellow"/>
               </w:rPr>
               <w:fldChar w:fldCharType="begin"/>
             </w:r>
@@ -1355,6 +1300,7 @@
                 <w:webHidden/>
                 <w:sz w:val="24"/>
                 <w:szCs w:val="24"/>
+                <w:highlight w:val="yellow"/>
               </w:rPr>
               <w:instrText xml:space="preserve"> PAGEREF _Toc238628407 \h </w:instrText>
             </w:r>
@@ -1365,6 +1311,7 @@
                 <w:webHidden/>
                 <w:sz w:val="24"/>
                 <w:szCs w:val="24"/>
+                <w:highlight w:val="yellow"/>
               </w:rPr>
             </w:r>
             <w:r>
@@ -1374,6 +1321,7 @@
                 <w:webHidden/>
                 <w:sz w:val="24"/>
                 <w:szCs w:val="24"/>
+                <w:highlight w:val="yellow"/>
               </w:rPr>
               <w:fldChar w:fldCharType="separate"/>
             </w:r>
@@ -1384,6 +1332,7 @@
                 <w:webHidden/>
                 <w:sz w:val="24"/>
                 <w:szCs w:val="24"/>
+                <w:highlight w:val="yellow"/>
               </w:rPr>
               <w:t>14</w:t>
             </w:r>
@@ -1394,6 +1343,7 @@
                 <w:webHidden/>
                 <w:sz w:val="24"/>
                 <w:szCs w:val="24"/>
+                <w:highlight w:val="yellow"/>
               </w:rPr>
               <w:fldChar w:fldCharType="end"/>
             </w:r>
@@ -1412,6 +1362,7 @@
               <w:kern w:val="0"/>
               <w:sz w:val="24"/>
               <w:szCs w:val="24"/>
+              <w:highlight w:val="yellow"/>
               <w:lang w:eastAsia="es-AR"/>
             </w:rPr>
           </w:pPr>
@@ -1424,6 +1375,7 @@
                 <w:noProof/>
                 <w:sz w:val="24"/>
                 <w:szCs w:val="24"/>
+                <w:highlight w:val="yellow"/>
               </w:rPr>
               <w:t>ETAPA 7: Preparación y exposición final</w:t>
             </w:r>
@@ -1434,6 +1386,7 @@
                 <w:webHidden/>
                 <w:sz w:val="24"/>
                 <w:szCs w:val="24"/>
+                <w:highlight w:val="yellow"/>
               </w:rPr>
               <w:tab/>
             </w:r>
@@ -1444,6 +1397,7 @@
                 <w:webHidden/>
                 <w:sz w:val="24"/>
                 <w:szCs w:val="24"/>
+                <w:highlight w:val="yellow"/>
               </w:rPr>
               <w:fldChar w:fldCharType="begin"/>
             </w:r>
@@ -1454,6 +1408,7 @@
                 <w:webHidden/>
                 <w:sz w:val="24"/>
                 <w:szCs w:val="24"/>
+                <w:highlight w:val="yellow"/>
               </w:rPr>
               <w:instrText xml:space="preserve"> PAGEREF _Toc238628408 \h </w:instrText>
             </w:r>
@@ -1464,6 +1419,7 @@
                 <w:webHidden/>
                 <w:sz w:val="24"/>
                 <w:szCs w:val="24"/>
+                <w:highlight w:val="yellow"/>
               </w:rPr>
             </w:r>
             <w:r>
@@ -1473,6 +1429,7 @@
                 <w:webHidden/>
                 <w:sz w:val="24"/>
                 <w:szCs w:val="24"/>
+                <w:highlight w:val="yellow"/>
               </w:rPr>
               <w:fldChar w:fldCharType="separate"/>
             </w:r>
@@ -1483,6 +1440,7 @@
                 <w:webHidden/>
                 <w:sz w:val="24"/>
                 <w:szCs w:val="24"/>
+                <w:highlight w:val="yellow"/>
               </w:rPr>
               <w:t>14</w:t>
             </w:r>
@@ -1493,6 +1451,7 @@
                 <w:webHidden/>
                 <w:sz w:val="24"/>
                 <w:szCs w:val="24"/>
+                <w:highlight w:val="yellow"/>
               </w:rPr>
               <w:fldChar w:fldCharType="end"/>
             </w:r>
@@ -1511,6 +1470,7 @@
               <w:kern w:val="0"/>
               <w:sz w:val="24"/>
               <w:szCs w:val="24"/>
+              <w:highlight w:val="yellow"/>
               <w:lang w:eastAsia="es-AR"/>
             </w:rPr>
           </w:pPr>
@@ -1523,6 +1483,7 @@
                 <w:noProof/>
                 <w:sz w:val="24"/>
                 <w:szCs w:val="24"/>
+                <w:highlight w:val="yellow"/>
               </w:rPr>
               <w:t>ETAPA 8: Presentación y evaluación final</w:t>
             </w:r>
@@ -1533,6 +1494,7 @@
                 <w:webHidden/>
                 <w:sz w:val="24"/>
                 <w:szCs w:val="24"/>
+                <w:highlight w:val="yellow"/>
               </w:rPr>
               <w:tab/>
             </w:r>
@@ -1543,6 +1505,7 @@
                 <w:webHidden/>
                 <w:sz w:val="24"/>
                 <w:szCs w:val="24"/>
+                <w:highlight w:val="yellow"/>
               </w:rPr>
               <w:fldChar w:fldCharType="begin"/>
             </w:r>
@@ -1553,6 +1516,7 @@
                 <w:webHidden/>
                 <w:sz w:val="24"/>
                 <w:szCs w:val="24"/>
+                <w:highlight w:val="yellow"/>
               </w:rPr>
               <w:instrText xml:space="preserve"> PAGEREF _Toc238628409 \h </w:instrText>
             </w:r>
@@ -1563,6 +1527,7 @@
                 <w:webHidden/>
                 <w:sz w:val="24"/>
                 <w:szCs w:val="24"/>
+                <w:highlight w:val="yellow"/>
               </w:rPr>
             </w:r>
             <w:r>
@@ -1572,6 +1537,7 @@
                 <w:webHidden/>
                 <w:sz w:val="24"/>
                 <w:szCs w:val="24"/>
+                <w:highlight w:val="yellow"/>
               </w:rPr>
               <w:fldChar w:fldCharType="separate"/>
             </w:r>
@@ -1582,6 +1548,7 @@
                 <w:webHidden/>
                 <w:sz w:val="24"/>
                 <w:szCs w:val="24"/>
+                <w:highlight w:val="yellow"/>
               </w:rPr>
               <w:t>14</w:t>
             </w:r>
@@ -1592,6 +1559,7 @@
                 <w:webHidden/>
                 <w:sz w:val="24"/>
                 <w:szCs w:val="24"/>
+                <w:highlight w:val="yellow"/>
               </w:rPr>
               <w:fldChar w:fldCharType="end"/>
             </w:r>
@@ -1610,6 +1578,7 @@
               <w:kern w:val="0"/>
               <w:sz w:val="24"/>
               <w:szCs w:val="24"/>
+              <w:highlight w:val="yellow"/>
               <w:lang w:eastAsia="es-AR"/>
             </w:rPr>
           </w:pPr>
@@ -1622,6 +1591,7 @@
                 <w:noProof/>
                 <w:sz w:val="24"/>
                 <w:szCs w:val="24"/>
+                <w:highlight w:val="yellow"/>
               </w:rPr>
               <w:t>ETAPA 9: Mejoras post-feria</w:t>
             </w:r>
@@ -1632,6 +1602,7 @@
                 <w:webHidden/>
                 <w:sz w:val="24"/>
                 <w:szCs w:val="24"/>
+                <w:highlight w:val="yellow"/>
               </w:rPr>
               <w:tab/>
             </w:r>
@@ -1642,6 +1613,7 @@
                 <w:webHidden/>
                 <w:sz w:val="24"/>
                 <w:szCs w:val="24"/>
+                <w:highlight w:val="yellow"/>
               </w:rPr>
               <w:fldChar w:fldCharType="begin"/>
             </w:r>
@@ -1652,6 +1624,7 @@
                 <w:webHidden/>
                 <w:sz w:val="24"/>
                 <w:szCs w:val="24"/>
+                <w:highlight w:val="yellow"/>
               </w:rPr>
               <w:instrText xml:space="preserve"> PAGEREF _Toc238628410 \h </w:instrText>
             </w:r>
@@ -1662,6 +1635,7 @@
                 <w:webHidden/>
                 <w:sz w:val="24"/>
                 <w:szCs w:val="24"/>
+                <w:highlight w:val="yellow"/>
               </w:rPr>
             </w:r>
             <w:r>
@@ -1671,6 +1645,7 @@
                 <w:webHidden/>
                 <w:sz w:val="24"/>
                 <w:szCs w:val="24"/>
+                <w:highlight w:val="yellow"/>
               </w:rPr>
               <w:fldChar w:fldCharType="separate"/>
             </w:r>
@@ -1681,6 +1656,7 @@
                 <w:webHidden/>
                 <w:sz w:val="24"/>
                 <w:szCs w:val="24"/>
+                <w:highlight w:val="yellow"/>
               </w:rPr>
               <w:t>14</w:t>
             </w:r>
@@ -1691,6 +1667,7 @@
                 <w:webHidden/>
                 <w:sz w:val="24"/>
                 <w:szCs w:val="24"/>
+                <w:highlight w:val="yellow"/>
               </w:rPr>
               <w:fldChar w:fldCharType="end"/>
             </w:r>
@@ -1721,6 +1698,7 @@
                 <w:noProof/>
                 <w:sz w:val="24"/>
                 <w:szCs w:val="24"/>
+                <w:highlight w:val="yellow"/>
               </w:rPr>
               <w:t>ETAPA 10: Defensa final</w:t>
             </w:r>
@@ -1731,6 +1709,7 @@
                 <w:webHidden/>
                 <w:sz w:val="24"/>
                 <w:szCs w:val="24"/>
+                <w:highlight w:val="yellow"/>
               </w:rPr>
               <w:tab/>
             </w:r>
@@ -1741,6 +1720,7 @@
                 <w:webHidden/>
                 <w:sz w:val="24"/>
                 <w:szCs w:val="24"/>
+                <w:highlight w:val="yellow"/>
               </w:rPr>
               <w:fldChar w:fldCharType="begin"/>
             </w:r>
@@ -1751,6 +1731,7 @@
                 <w:webHidden/>
                 <w:sz w:val="24"/>
                 <w:szCs w:val="24"/>
+                <w:highlight w:val="yellow"/>
               </w:rPr>
               <w:instrText xml:space="preserve"> PAGEREF _Toc238628411 \h </w:instrText>
             </w:r>
@@ -1761,6 +1742,7 @@
                 <w:webHidden/>
                 <w:sz w:val="24"/>
                 <w:szCs w:val="24"/>
+                <w:highlight w:val="yellow"/>
               </w:rPr>
             </w:r>
             <w:r>
@@ -1770,6 +1752,7 @@
                 <w:webHidden/>
                 <w:sz w:val="24"/>
                 <w:szCs w:val="24"/>
+                <w:highlight w:val="yellow"/>
               </w:rPr>
               <w:fldChar w:fldCharType="separate"/>
             </w:r>
@@ -1780,6 +1763,7 @@
                 <w:webHidden/>
                 <w:sz w:val="24"/>
                 <w:szCs w:val="24"/>
+                <w:highlight w:val="yellow"/>
               </w:rPr>
               <w:t>14</w:t>
             </w:r>
@@ -1790,6 +1774,7 @@
                 <w:webHidden/>
                 <w:sz w:val="24"/>
                 <w:szCs w:val="24"/>
+                <w:highlight w:val="yellow"/>
               </w:rPr>
               <w:fldChar w:fldCharType="end"/>
             </w:r>
@@ -4865,25 +4850,7 @@
           <w:sz w:val="24"/>
           <w:szCs w:val="24"/>
         </w:rPr>
-        <w:t xml:space="preserve">Se seleccionó una idea de toda la lista, nuestro siguiente paso fue averiguar </w:t>
-      </w:r>
-      <w:proofErr w:type="spellStart"/>
-      <w:r>
-        <w:rPr>
-          <w:rFonts w:asciiTheme="minorHAnsi" w:hAnsiTheme="minorHAnsi" w:cstheme="minorHAnsi"/>
-          <w:sz w:val="24"/>
-          <w:szCs w:val="24"/>
-        </w:rPr>
-        <w:t>que</w:t>
-      </w:r>
-      <w:proofErr w:type="spellEnd"/>
-      <w:r>
-        <w:rPr>
-          <w:rFonts w:asciiTheme="minorHAnsi" w:hAnsiTheme="minorHAnsi" w:cstheme="minorHAnsi"/>
-          <w:sz w:val="24"/>
-          <w:szCs w:val="24"/>
-        </w:rPr>
-        <w:t xml:space="preserve"> tecnología iba a ser </w:t>
+        <w:t xml:space="preserve">Se seleccionó una idea de toda la lista, nuestro siguiente paso fue averiguar que tecnología iba a ser </w:t>
       </w:r>
       <w:r>
         <w:rPr>
@@ -5122,16 +5089,14 @@
         </w:rPr>
         <w:t xml:space="preserve"> será utilizada para agregar funcionalidades y generar interacciones en la página web, con </w:t>
       </w:r>
-      <w:proofErr w:type="spellStart"/>
-      <w:r>
-        <w:rPr>
-          <w:rFonts w:asciiTheme="minorHAnsi" w:hAnsiTheme="minorHAnsi" w:cstheme="minorHAnsi"/>
-          <w:sz w:val="24"/>
-          <w:szCs w:val="24"/>
-        </w:rPr>
-        <w:t>el</w:t>
-      </w:r>
-      <w:proofErr w:type="spellEnd"/>
+      <w:r>
+        <w:rPr>
+          <w:rFonts w:asciiTheme="minorHAnsi" w:hAnsiTheme="minorHAnsi" w:cstheme="minorHAnsi"/>
+          <w:sz w:val="24"/>
+          <w:szCs w:val="24"/>
+        </w:rPr>
+        <w:t>él</w:t>
+      </w:r>
       <w:r>
         <w:rPr>
           <w:rFonts w:asciiTheme="minorHAnsi" w:hAnsiTheme="minorHAnsi" w:cstheme="minorHAnsi"/>
@@ -5958,6 +5923,64 @@
                 <pic:pic xmlns:pic="http://schemas.openxmlformats.org/drawingml/2006/picture">
                   <pic:nvPicPr>
                     <pic:cNvPr id="1" name="Imagen 1"/>
+                    <pic:cNvPicPr/>
+                  </pic:nvPicPr>
+                  <pic:blipFill>
+                    <a:blip r:embed="rId10">
+                      <a:extLst>
+                        <a:ext uri="{28A0092B-C50C-407E-A947-70E740481C1C}">
+                          <a14:useLocalDpi xmlns:a14="http://schemas.microsoft.com/office/drawing/2010/main" val="0"/>
+                        </a:ext>
+                      </a:extLst>
+                    </a:blip>
+                    <a:stretch>
+                      <a:fillRect/>
+                    </a:stretch>
+                  </pic:blipFill>
+                  <pic:spPr>
+                    <a:xfrm>
+                      <a:off x="0" y="0"/>
+                      <a:ext cx="5274310" cy="3955415"/>
+                    </a:xfrm>
+                    <a:prstGeom prst="rect">
+                      <a:avLst/>
+                    </a:prstGeom>
+                  </pic:spPr>
+                </pic:pic>
+              </a:graphicData>
+            </a:graphic>
+          </wp:inline>
+        </w:drawing>
+      </w:r>
+    </w:p>
+    <w:p>
+      <w:pPr>
+        <w:pStyle w:val="NormalWeb"/>
+        <w:spacing w:line="480" w:lineRule="auto"/>
+        <w:rPr>
+          <w:rFonts w:asciiTheme="minorHAnsi" w:hAnsiTheme="minorHAnsi" w:cstheme="minorHAnsi"/>
+          <w:lang w:val="es-AR"/>
+        </w:rPr>
+      </w:pPr>
+      <w:r>
+        <w:rPr>
+          <w:rFonts w:asciiTheme="minorHAnsi" w:hAnsiTheme="minorHAnsi" w:cstheme="minorHAnsi"/>
+          <w:noProof/>
+          <w:lang w:val="es-AR"/>
+        </w:rPr>
+        <w:drawing>
+          <wp:inline distT="0" distB="0" distL="0" distR="0" wp14:anchorId="715BBE42" wp14:editId="4BEEFC8E">
+            <wp:extent cx="5274310" cy="3955415"/>
+            <wp:effectExtent l="0" t="0" r="2540" b="6985"/>
+            <wp:docPr id="2" name="Imagen 2"/>
+            <wp:cNvGraphicFramePr>
+              <a:graphicFrameLocks xmlns:a="http://schemas.openxmlformats.org/drawingml/2006/main" noChangeAspect="1"/>
+            </wp:cNvGraphicFramePr>
+            <a:graphic xmlns:a="http://schemas.openxmlformats.org/drawingml/2006/main">
+              <a:graphicData uri="http://schemas.openxmlformats.org/drawingml/2006/picture">
+                <pic:pic xmlns:pic="http://schemas.openxmlformats.org/drawingml/2006/picture">
+                  <pic:nvPicPr>
+                    <pic:cNvPr id="2" name="Imagen 2"/>
                     <pic:cNvPicPr/>
                   </pic:nvPicPr>
                   <pic:blipFill>
@@ -5990,64 +6013,6 @@
     </w:p>
     <w:p>
       <w:pPr>
-        <w:pStyle w:val="NormalWeb"/>
-        <w:spacing w:line="480" w:lineRule="auto"/>
-        <w:rPr>
-          <w:rFonts w:asciiTheme="minorHAnsi" w:hAnsiTheme="minorHAnsi" w:cstheme="minorHAnsi"/>
-          <w:lang w:val="es-AR"/>
-        </w:rPr>
-      </w:pPr>
-      <w:r>
-        <w:rPr>
-          <w:rFonts w:asciiTheme="minorHAnsi" w:hAnsiTheme="minorHAnsi" w:cstheme="minorHAnsi"/>
-          <w:noProof/>
-          <w:lang w:val="es-AR"/>
-        </w:rPr>
-        <w:drawing>
-          <wp:inline distT="0" distB="0" distL="0" distR="0" wp14:anchorId="715BBE42" wp14:editId="4BEEFC8E">
-            <wp:extent cx="5274310" cy="3955415"/>
-            <wp:effectExtent l="0" t="0" r="2540" b="6985"/>
-            <wp:docPr id="2" name="Imagen 2"/>
-            <wp:cNvGraphicFramePr>
-              <a:graphicFrameLocks xmlns:a="http://schemas.openxmlformats.org/drawingml/2006/main" noChangeAspect="1"/>
-            </wp:cNvGraphicFramePr>
-            <a:graphic xmlns:a="http://schemas.openxmlformats.org/drawingml/2006/main">
-              <a:graphicData uri="http://schemas.openxmlformats.org/drawingml/2006/picture">
-                <pic:pic xmlns:pic="http://schemas.openxmlformats.org/drawingml/2006/picture">
-                  <pic:nvPicPr>
-                    <pic:cNvPr id="2" name="Imagen 2"/>
-                    <pic:cNvPicPr/>
-                  </pic:nvPicPr>
-                  <pic:blipFill>
-                    <a:blip r:embed="rId12">
-                      <a:extLst>
-                        <a:ext uri="{28A0092B-C50C-407E-A947-70E740481C1C}">
-                          <a14:useLocalDpi xmlns:a14="http://schemas.microsoft.com/office/drawing/2010/main" val="0"/>
-                        </a:ext>
-                      </a:extLst>
-                    </a:blip>
-                    <a:stretch>
-                      <a:fillRect/>
-                    </a:stretch>
-                  </pic:blipFill>
-                  <pic:spPr>
-                    <a:xfrm>
-                      <a:off x="0" y="0"/>
-                      <a:ext cx="5274310" cy="3955415"/>
-                    </a:xfrm>
-                    <a:prstGeom prst="rect">
-                      <a:avLst/>
-                    </a:prstGeom>
-                  </pic:spPr>
-                </pic:pic>
-              </a:graphicData>
-            </a:graphic>
-          </wp:inline>
-        </w:drawing>
-      </w:r>
-    </w:p>
-    <w:p>
-      <w:pPr>
         <w:spacing w:line="480" w:lineRule="auto"/>
         <w:jc w:val="left"/>
         <w:rPr>
@@ -6337,25 +6302,6 @@
           <w:szCs w:val="24"/>
         </w:rPr>
       </w:pPr>
-      <w:r>
-        <w:rPr>
-          <w:rFonts w:asciiTheme="minorHAnsi" w:hAnsiTheme="minorHAnsi" w:cstheme="minorHAnsi"/>
-          <w:sz w:val="24"/>
-          <w:szCs w:val="24"/>
-        </w:rPr>
-        <w:t>Registro de usuario</w:t>
-      </w:r>
-    </w:p>
-    <w:p>
-      <w:pPr>
-        <w:spacing w:line="480" w:lineRule="auto"/>
-        <w:jc w:val="left"/>
-        <w:rPr>
-          <w:rFonts w:asciiTheme="minorHAnsi" w:hAnsiTheme="minorHAnsi" w:cstheme="minorHAnsi"/>
-          <w:sz w:val="24"/>
-          <w:szCs w:val="24"/>
-        </w:rPr>
-      </w:pPr>
     </w:p>
     <w:p>
       <w:pPr>
@@ -6406,7 +6352,7 @@
           <w:sz w:val="24"/>
           <w:szCs w:val="24"/>
         </w:rPr>
-        <w:t xml:space="preserve">Se realizó la estructura y la organización de las carpetas en GitHub para nuestro proyecto, se crearon ramas individuales para cada integrante del equipo y </w:t>
+        <w:t xml:space="preserve">Se realizó la estructura y la organización de las carpetas en GitHub para nuestro proyecto, se crearon ramas individuales para cada integrante del equipo y aprendimos como resolver los conflictos al momento de que ambas partes </w:t>
       </w:r>
       <w:r>
         <w:rPr>
@@ -6415,7 +6361,7 @@
           <w:szCs w:val="24"/>
         </w:rPr>
         <w:lastRenderedPageBreak/>
-        <w:t>aprendimos como resolver los conflictos al momento de que ambas partes modifiquen el mismo archivo</w:t>
+        <w:t>modifiquen el mismo archivo</w:t>
       </w:r>
       <w:r>
         <w:rPr>
@@ -6569,7 +6515,7 @@
                     <pic:cNvPicPr/>
                   </pic:nvPicPr>
                   <pic:blipFill>
-                    <a:blip r:embed="rId13">
+                    <a:blip r:embed="rId12">
                       <a:extLst>
                         <a:ext uri="{28A0092B-C50C-407E-A947-70E740481C1C}">
                           <a14:useLocalDpi xmlns:a14="http://schemas.microsoft.com/office/drawing/2010/main" val="0"/>
@@ -6629,7 +6575,7 @@
                     <pic:cNvPicPr/>
                   </pic:nvPicPr>
                   <pic:blipFill>
-                    <a:blip r:embed="rId14" cstate="print">
+                    <a:blip r:embed="rId13" cstate="print">
                       <a:extLst>
                         <a:ext uri="{28A0092B-C50C-407E-A947-70E740481C1C}">
                           <a14:useLocalDpi xmlns:a14="http://schemas.microsoft.com/office/drawing/2010/main" val="0"/>
@@ -7592,7 +7538,7 @@
                     </pic:cNvPicPr>
                   </pic:nvPicPr>
                   <pic:blipFill>
-                    <a:blip r:embed="rId15"/>
+                    <a:blip r:embed="rId14"/>
                     <a:stretch>
                       <a:fillRect/>
                     </a:stretch>
@@ -7657,7 +7603,7 @@
                     </pic:cNvPicPr>
                   </pic:nvPicPr>
                   <pic:blipFill>
-                    <a:blip r:embed="rId16"/>
+                    <a:blip r:embed="rId15"/>
                     <a:stretch>
                       <a:fillRect/>
                     </a:stretch>
@@ -7679,6 +7625,8 @@
       </w:r>
     </w:p>
     <w:sectPr>
+      <w:headerReference w:type="default" r:id="rId16"/>
+      <w:footerReference w:type="default" r:id="rId17"/>
       <w:pgSz w:w="11906" w:h="16838"/>
       <w:pgMar w:top="1440" w:right="1800" w:bottom="1440" w:left="1800" w:header="720" w:footer="720" w:gutter="0"/>
       <w:cols w:space="720"/>
@@ -11792,6 +11740,10 @@
 </file>
 
 <file path=customXml/item1.xml><?xml version="1.0" encoding="utf-8"?>
+<b:Sources xmlns:b="http://schemas.openxmlformats.org/officeDocument/2006/bibliography" xmlns="http://schemas.openxmlformats.org/officeDocument/2006/bibliography" SelectedStyle="\APASixthEditionOfficeOnline.xsl" StyleName="APA" Version="6"/>
+</file>
+
+<file path=customXml/item2.xml><?xml version="1.0" encoding="utf-8"?>
 <s:customData xmlns="http://www.wps.cn/officeDocument/2013/wpsCustomData" xmlns:s="http://www.wps.cn/officeDocument/2013/wpsCustomData">
   <customSectProps>
     <customSectPr>
@@ -11805,22 +11757,18 @@
 </s:customData>
 </file>
 
-<file path=customXml/item2.xml><?xml version="1.0" encoding="utf-8"?>
-<b:Sources xmlns:b="http://schemas.openxmlformats.org/officeDocument/2006/bibliography" xmlns="http://schemas.openxmlformats.org/officeDocument/2006/bibliography" SelectedStyle="\APASixthEditionOfficeOnline.xsl" StyleName="APA" Version="6"/>
+<file path=customXml/itemProps1.xml><?xml version="1.0" encoding="utf-8"?>
+<ds:datastoreItem xmlns:ds="http://schemas.openxmlformats.org/officeDocument/2006/customXml" ds:itemID="{6C5F95A5-FBC3-48FD-8FFB-6954C700CD4F}">
+  <ds:schemaRefs>
+    <ds:schemaRef ds:uri="http://schemas.openxmlformats.org/officeDocument/2006/bibliography"/>
+  </ds:schemaRefs>
+</ds:datastoreItem>
 </file>
 
-<file path=customXml/itemProps1.xml><?xml version="1.0" encoding="utf-8"?>
+<file path=customXml/itemProps2.xml><?xml version="1.0" encoding="utf-8"?>
 <ds:datastoreItem xmlns:ds="http://schemas.openxmlformats.org/officeDocument/2006/customXml" ds:itemID="{B1977F7D-205B-4081-913C-38D41E755F92}">
   <ds:schemaRefs>
     <ds:schemaRef ds:uri="http://www.wps.cn/officeDocument/2013/wpsCustomData"/>
   </ds:schemaRefs>
 </ds:datastoreItem>
-</file>
-
-<file path=customXml/itemProps2.xml><?xml version="1.0" encoding="utf-8"?>
-<ds:datastoreItem xmlns:ds="http://schemas.openxmlformats.org/officeDocument/2006/customXml" ds:itemID="{6C5F95A5-FBC3-48FD-8FFB-6954C700CD4F}">
-  <ds:schemaRefs>
-    <ds:schemaRef ds:uri="http://schemas.openxmlformats.org/officeDocument/2006/bibliography"/>
-  </ds:schemaRefs>
-</ds:datastoreItem>
 </file>
</xml_diff>

<commit_message>
docs(PDF): Subido archivo de logotipos y fuentes
</commit_message>
<xml_diff>
--- a/docs/FAT.docx
+++ b/docs/FAT.docx
@@ -6772,7 +6772,6 @@
           <w:sz w:val="32"/>
           <w:szCs w:val="32"/>
         </w:rPr>
-        <w:lastRenderedPageBreak/>
         <w:t xml:space="preserve">ETAPA </w:t>
       </w:r>
       <w:r>
@@ -6817,6 +6816,7 @@
       </w:r>
       <w:bookmarkEnd w:id="8"/>
     </w:p>
+    <w:p/>
     <w:p>
       <w:pPr>
         <w:pStyle w:val="Ttulo3"/>
@@ -6834,6 +6834,7 @@
           <w:sz w:val="32"/>
           <w:szCs w:val="32"/>
         </w:rPr>
+        <w:lastRenderedPageBreak/>
         <w:t xml:space="preserve">ETAPA </w:t>
       </w:r>
       <w:r>
@@ -7098,535 +7099,9 @@
       </w:r>
       <w:bookmarkEnd w:id="14"/>
     </w:p>
-    <w:p>
-      <w:pPr>
-        <w:spacing w:line="480" w:lineRule="auto"/>
-        <w:rPr>
-          <w:rFonts w:asciiTheme="minorHAnsi" w:hAnsiTheme="minorHAnsi" w:cstheme="minorHAnsi"/>
-          <w:sz w:val="24"/>
-          <w:szCs w:val="24"/>
-        </w:rPr>
-      </w:pPr>
-    </w:p>
-    <w:p>
-      <w:pPr>
-        <w:spacing w:line="480" w:lineRule="auto"/>
-        <w:rPr>
-          <w:rFonts w:asciiTheme="minorHAnsi" w:hAnsiTheme="minorHAnsi" w:cstheme="minorHAnsi"/>
-          <w:sz w:val="24"/>
-          <w:szCs w:val="24"/>
-        </w:rPr>
-      </w:pPr>
-    </w:p>
-    <w:p>
-      <w:pPr>
-        <w:spacing w:line="480" w:lineRule="auto"/>
-        <w:rPr>
-          <w:rFonts w:asciiTheme="minorHAnsi" w:hAnsiTheme="minorHAnsi" w:cstheme="minorHAnsi"/>
-          <w:sz w:val="24"/>
-          <w:szCs w:val="24"/>
-        </w:rPr>
-      </w:pPr>
-    </w:p>
-    <w:p>
-      <w:pPr>
-        <w:spacing w:line="480" w:lineRule="auto"/>
-        <w:rPr>
-          <w:rFonts w:asciiTheme="minorHAnsi" w:hAnsiTheme="minorHAnsi" w:cstheme="minorHAnsi"/>
-          <w:sz w:val="24"/>
-          <w:szCs w:val="24"/>
-        </w:rPr>
-      </w:pPr>
-    </w:p>
-    <w:p>
-      <w:pPr>
-        <w:spacing w:line="480" w:lineRule="auto"/>
-        <w:rPr>
-          <w:rFonts w:asciiTheme="minorHAnsi" w:hAnsiTheme="minorHAnsi" w:cstheme="minorHAnsi"/>
-          <w:sz w:val="24"/>
-          <w:szCs w:val="24"/>
-        </w:rPr>
-      </w:pPr>
-    </w:p>
-    <w:p>
-      <w:pPr>
-        <w:spacing w:line="480" w:lineRule="auto"/>
-        <w:rPr>
-          <w:rFonts w:asciiTheme="minorHAnsi" w:hAnsiTheme="minorHAnsi" w:cstheme="minorHAnsi"/>
-          <w:sz w:val="24"/>
-          <w:szCs w:val="24"/>
-        </w:rPr>
-      </w:pPr>
-    </w:p>
-    <w:p>
-      <w:pPr>
-        <w:spacing w:line="480" w:lineRule="auto"/>
-        <w:rPr>
-          <w:rFonts w:asciiTheme="minorHAnsi" w:hAnsiTheme="minorHAnsi" w:cstheme="minorHAnsi"/>
-          <w:sz w:val="24"/>
-          <w:szCs w:val="24"/>
-        </w:rPr>
-      </w:pPr>
-    </w:p>
-    <w:p>
-      <w:pPr>
-        <w:spacing w:line="480" w:lineRule="auto"/>
-        <w:rPr>
-          <w:rFonts w:asciiTheme="minorHAnsi" w:hAnsiTheme="minorHAnsi" w:cstheme="minorHAnsi"/>
-          <w:sz w:val="24"/>
-          <w:szCs w:val="24"/>
-        </w:rPr>
-      </w:pPr>
-    </w:p>
-    <w:p>
-      <w:pPr>
-        <w:spacing w:line="480" w:lineRule="auto"/>
-        <w:rPr>
-          <w:rFonts w:asciiTheme="minorHAnsi" w:hAnsiTheme="minorHAnsi" w:cstheme="minorHAnsi"/>
-          <w:sz w:val="24"/>
-          <w:szCs w:val="24"/>
-        </w:rPr>
-      </w:pPr>
-    </w:p>
-    <w:p>
-      <w:pPr>
-        <w:spacing w:line="480" w:lineRule="auto"/>
-        <w:rPr>
-          <w:rFonts w:asciiTheme="minorHAnsi" w:hAnsiTheme="minorHAnsi" w:cstheme="minorHAnsi"/>
-          <w:sz w:val="24"/>
-          <w:szCs w:val="24"/>
-        </w:rPr>
-      </w:pPr>
-    </w:p>
-    <w:p>
-      <w:pPr>
-        <w:spacing w:line="480" w:lineRule="auto"/>
-        <w:rPr>
-          <w:rFonts w:asciiTheme="minorHAnsi" w:hAnsiTheme="minorHAnsi" w:cstheme="minorHAnsi"/>
-          <w:sz w:val="24"/>
-          <w:szCs w:val="24"/>
-        </w:rPr>
-      </w:pPr>
-    </w:p>
-    <w:p>
-      <w:pPr>
-        <w:spacing w:line="480" w:lineRule="auto"/>
-        <w:rPr>
-          <w:rFonts w:asciiTheme="minorHAnsi" w:hAnsiTheme="minorHAnsi" w:cstheme="minorHAnsi"/>
-          <w:sz w:val="24"/>
-          <w:szCs w:val="24"/>
-        </w:rPr>
-      </w:pPr>
-    </w:p>
-    <w:p>
-      <w:pPr>
-        <w:spacing w:line="480" w:lineRule="auto"/>
-        <w:rPr>
-          <w:rFonts w:asciiTheme="minorHAnsi" w:hAnsiTheme="minorHAnsi" w:cstheme="minorHAnsi"/>
-          <w:sz w:val="24"/>
-          <w:szCs w:val="24"/>
-        </w:rPr>
-      </w:pPr>
-    </w:p>
-    <w:p>
-      <w:pPr>
-        <w:spacing w:line="480" w:lineRule="auto"/>
-        <w:rPr>
-          <w:rFonts w:asciiTheme="minorHAnsi" w:hAnsiTheme="minorHAnsi" w:cstheme="minorHAnsi"/>
-          <w:sz w:val="24"/>
-          <w:szCs w:val="24"/>
-        </w:rPr>
-      </w:pPr>
-    </w:p>
-    <w:p>
-      <w:pPr>
-        <w:spacing w:line="480" w:lineRule="auto"/>
-        <w:rPr>
-          <w:rFonts w:asciiTheme="minorHAnsi" w:hAnsiTheme="minorHAnsi" w:cstheme="minorHAnsi"/>
-          <w:sz w:val="24"/>
-          <w:szCs w:val="24"/>
-        </w:rPr>
-      </w:pPr>
-    </w:p>
-    <w:p>
-      <w:pPr>
-        <w:spacing w:line="480" w:lineRule="auto"/>
-        <w:rPr>
-          <w:rFonts w:asciiTheme="minorHAnsi" w:hAnsiTheme="minorHAnsi" w:cstheme="minorHAnsi"/>
-          <w:sz w:val="24"/>
-          <w:szCs w:val="24"/>
-        </w:rPr>
-      </w:pPr>
-    </w:p>
-    <w:p>
-      <w:pPr>
-        <w:spacing w:line="480" w:lineRule="auto"/>
-        <w:rPr>
-          <w:rFonts w:asciiTheme="minorHAnsi" w:hAnsiTheme="minorHAnsi" w:cstheme="minorHAnsi"/>
-          <w:sz w:val="24"/>
-          <w:szCs w:val="24"/>
-        </w:rPr>
-      </w:pPr>
-    </w:p>
-    <w:p>
-      <w:pPr>
-        <w:spacing w:line="480" w:lineRule="auto"/>
-        <w:rPr>
-          <w:rFonts w:asciiTheme="minorHAnsi" w:hAnsiTheme="minorHAnsi" w:cstheme="minorHAnsi"/>
-          <w:sz w:val="24"/>
-          <w:szCs w:val="24"/>
-        </w:rPr>
-      </w:pPr>
-    </w:p>
-    <w:p>
-      <w:pPr>
-        <w:spacing w:line="480" w:lineRule="auto"/>
-        <w:rPr>
-          <w:rFonts w:asciiTheme="minorHAnsi" w:hAnsiTheme="minorHAnsi" w:cstheme="minorHAnsi"/>
-          <w:sz w:val="24"/>
-          <w:szCs w:val="24"/>
-        </w:rPr>
-      </w:pPr>
-    </w:p>
-    <w:p>
-      <w:pPr>
-        <w:spacing w:line="480" w:lineRule="auto"/>
-        <w:rPr>
-          <w:rFonts w:asciiTheme="minorHAnsi" w:hAnsiTheme="minorHAnsi" w:cstheme="minorHAnsi"/>
-          <w:sz w:val="24"/>
-          <w:szCs w:val="24"/>
-        </w:rPr>
-      </w:pPr>
-    </w:p>
-    <w:p>
-      <w:pPr>
-        <w:spacing w:line="480" w:lineRule="auto"/>
-        <w:rPr>
-          <w:rFonts w:asciiTheme="minorHAnsi" w:hAnsiTheme="minorHAnsi" w:cstheme="minorHAnsi"/>
-          <w:sz w:val="24"/>
-          <w:szCs w:val="24"/>
-        </w:rPr>
-      </w:pPr>
-    </w:p>
-    <w:p>
-      <w:pPr>
-        <w:spacing w:line="480" w:lineRule="auto"/>
-        <w:rPr>
-          <w:rFonts w:asciiTheme="minorHAnsi" w:hAnsiTheme="minorHAnsi" w:cstheme="minorHAnsi"/>
-          <w:sz w:val="24"/>
-          <w:szCs w:val="24"/>
-        </w:rPr>
-      </w:pPr>
-    </w:p>
-    <w:p>
-      <w:pPr>
-        <w:spacing w:line="480" w:lineRule="auto"/>
-        <w:rPr>
-          <w:rFonts w:asciiTheme="minorHAnsi" w:hAnsiTheme="minorHAnsi" w:cstheme="minorHAnsi"/>
-          <w:sz w:val="24"/>
-          <w:szCs w:val="24"/>
-        </w:rPr>
-      </w:pPr>
-    </w:p>
-    <w:p>
-      <w:pPr>
-        <w:spacing w:line="480" w:lineRule="auto"/>
-        <w:rPr>
-          <w:rFonts w:asciiTheme="minorHAnsi" w:hAnsiTheme="minorHAnsi" w:cstheme="minorHAnsi"/>
-          <w:sz w:val="24"/>
-          <w:szCs w:val="24"/>
-        </w:rPr>
-      </w:pPr>
-    </w:p>
-    <w:p>
-      <w:pPr>
-        <w:spacing w:line="480" w:lineRule="auto"/>
-        <w:rPr>
-          <w:rFonts w:asciiTheme="minorHAnsi" w:hAnsiTheme="minorHAnsi" w:cstheme="minorHAnsi"/>
-          <w:sz w:val="24"/>
-          <w:szCs w:val="24"/>
-        </w:rPr>
-      </w:pPr>
-    </w:p>
-    <w:p>
-      <w:pPr>
-        <w:spacing w:line="480" w:lineRule="auto"/>
-        <w:rPr>
-          <w:rFonts w:asciiTheme="minorHAnsi" w:hAnsiTheme="minorHAnsi" w:cstheme="minorHAnsi"/>
-          <w:sz w:val="24"/>
-          <w:szCs w:val="24"/>
-        </w:rPr>
-      </w:pPr>
-    </w:p>
-    <w:p>
-      <w:pPr>
-        <w:spacing w:line="480" w:lineRule="auto"/>
-        <w:rPr>
-          <w:rFonts w:asciiTheme="minorHAnsi" w:hAnsiTheme="minorHAnsi" w:cstheme="minorHAnsi"/>
-          <w:sz w:val="24"/>
-          <w:szCs w:val="24"/>
-        </w:rPr>
-      </w:pPr>
-    </w:p>
-    <w:p>
-      <w:pPr>
-        <w:spacing w:line="480" w:lineRule="auto"/>
-        <w:rPr>
-          <w:rFonts w:asciiTheme="minorHAnsi" w:hAnsiTheme="minorHAnsi" w:cstheme="minorHAnsi"/>
-          <w:sz w:val="24"/>
-          <w:szCs w:val="24"/>
-        </w:rPr>
-      </w:pPr>
-    </w:p>
-    <w:p>
-      <w:pPr>
-        <w:spacing w:line="480" w:lineRule="auto"/>
-        <w:rPr>
-          <w:rFonts w:asciiTheme="minorHAnsi" w:hAnsiTheme="minorHAnsi" w:cstheme="minorHAnsi"/>
-          <w:sz w:val="24"/>
-          <w:szCs w:val="24"/>
-        </w:rPr>
-      </w:pPr>
-    </w:p>
-    <w:p>
-      <w:pPr>
-        <w:spacing w:line="480" w:lineRule="auto"/>
-        <w:rPr>
-          <w:rFonts w:asciiTheme="minorHAnsi" w:hAnsiTheme="minorHAnsi" w:cstheme="minorHAnsi"/>
-          <w:sz w:val="24"/>
-          <w:szCs w:val="24"/>
-        </w:rPr>
-      </w:pPr>
-    </w:p>
-    <w:p>
-      <w:pPr>
-        <w:spacing w:line="480" w:lineRule="auto"/>
-        <w:rPr>
-          <w:rFonts w:asciiTheme="minorHAnsi" w:hAnsiTheme="minorHAnsi" w:cstheme="minorHAnsi"/>
-          <w:sz w:val="24"/>
-          <w:szCs w:val="24"/>
-        </w:rPr>
-      </w:pPr>
-    </w:p>
-    <w:p>
-      <w:pPr>
-        <w:spacing w:line="480" w:lineRule="auto"/>
-        <w:rPr>
-          <w:rFonts w:asciiTheme="minorHAnsi" w:hAnsiTheme="minorHAnsi" w:cstheme="minorHAnsi"/>
-          <w:sz w:val="24"/>
-          <w:szCs w:val="24"/>
-        </w:rPr>
-      </w:pPr>
-    </w:p>
-    <w:p>
-      <w:pPr>
-        <w:spacing w:line="480" w:lineRule="auto"/>
-        <w:rPr>
-          <w:rFonts w:asciiTheme="minorHAnsi" w:hAnsiTheme="minorHAnsi" w:cstheme="minorHAnsi"/>
-          <w:sz w:val="24"/>
-          <w:szCs w:val="24"/>
-        </w:rPr>
-      </w:pPr>
-    </w:p>
-    <w:p>
-      <w:pPr>
-        <w:spacing w:line="480" w:lineRule="auto"/>
-        <w:rPr>
-          <w:rFonts w:asciiTheme="minorHAnsi" w:hAnsiTheme="minorHAnsi" w:cstheme="minorHAnsi"/>
-          <w:sz w:val="24"/>
-          <w:szCs w:val="24"/>
-        </w:rPr>
-      </w:pPr>
-    </w:p>
-    <w:p>
-      <w:pPr>
-        <w:spacing w:line="480" w:lineRule="auto"/>
-        <w:rPr>
-          <w:rFonts w:asciiTheme="minorHAnsi" w:hAnsiTheme="minorHAnsi" w:cstheme="minorHAnsi"/>
-          <w:sz w:val="24"/>
-          <w:szCs w:val="24"/>
-        </w:rPr>
-      </w:pPr>
-    </w:p>
-    <w:p>
-      <w:pPr>
-        <w:spacing w:line="480" w:lineRule="auto"/>
-        <w:rPr>
-          <w:rFonts w:asciiTheme="minorHAnsi" w:hAnsiTheme="minorHAnsi" w:cstheme="minorHAnsi"/>
-          <w:sz w:val="24"/>
-          <w:szCs w:val="24"/>
-        </w:rPr>
-      </w:pPr>
-    </w:p>
-    <w:p>
-      <w:pPr>
-        <w:spacing w:line="480" w:lineRule="auto"/>
-        <w:rPr>
-          <w:rFonts w:asciiTheme="minorHAnsi" w:hAnsiTheme="minorHAnsi" w:cstheme="minorHAnsi"/>
-          <w:sz w:val="24"/>
-          <w:szCs w:val="24"/>
-        </w:rPr>
-      </w:pPr>
-    </w:p>
-    <w:p>
-      <w:pPr>
-        <w:spacing w:line="480" w:lineRule="auto"/>
-        <w:rPr>
-          <w:rFonts w:asciiTheme="minorHAnsi" w:hAnsiTheme="minorHAnsi" w:cstheme="minorHAnsi"/>
-          <w:sz w:val="24"/>
-          <w:szCs w:val="24"/>
-        </w:rPr>
-      </w:pPr>
-    </w:p>
-    <w:p>
-      <w:pPr>
-        <w:pStyle w:val="Ttulo"/>
-        <w:spacing w:line="480" w:lineRule="auto"/>
-        <w:rPr>
-          <w:rFonts w:asciiTheme="minorHAnsi" w:hAnsiTheme="minorHAnsi" w:cstheme="minorHAnsi"/>
-          <w:sz w:val="24"/>
-          <w:szCs w:val="24"/>
-        </w:rPr>
-      </w:pPr>
-    </w:p>
-    <w:p>
-      <w:pPr>
-        <w:spacing w:line="480" w:lineRule="auto"/>
-      </w:pPr>
-    </w:p>
-    <w:p>
-      <w:pPr>
-        <w:spacing w:line="480" w:lineRule="auto"/>
-        <w:ind w:firstLineChars="127" w:firstLine="306"/>
-        <w:jc w:val="left"/>
-        <w:rPr>
-          <w:rFonts w:asciiTheme="minorHAnsi" w:hAnsiTheme="minorHAnsi" w:cstheme="minorHAnsi"/>
-          <w:b/>
-          <w:bCs/>
-          <w:i/>
-          <w:iCs/>
-          <w:sz w:val="24"/>
-          <w:szCs w:val="24"/>
-        </w:rPr>
-      </w:pPr>
-      <w:r>
-        <w:rPr>
-          <w:rFonts w:asciiTheme="minorHAnsi" w:hAnsiTheme="minorHAnsi" w:cstheme="minorHAnsi"/>
-          <w:b/>
-          <w:bCs/>
-          <w:i/>
-          <w:iCs/>
-          <w:noProof/>
-          <w:sz w:val="24"/>
-          <w:szCs w:val="24"/>
-        </w:rPr>
-        <w:drawing>
-          <wp:inline distT="0" distB="0" distL="114300" distR="114300" wp14:anchorId="0979DE5D" wp14:editId="23544178">
-            <wp:extent cx="4695190" cy="3521710"/>
-            <wp:effectExtent l="0" t="0" r="13970" b="13970"/>
-            <wp:docPr id="5" name="Imagen 5" descr="Gráfico análisis FODA  DAFO profesional corporativo azul (1)"/>
-            <wp:cNvGraphicFramePr>
-              <a:graphicFrameLocks xmlns:a="http://schemas.openxmlformats.org/drawingml/2006/main" noChangeAspect="1"/>
-            </wp:cNvGraphicFramePr>
-            <a:graphic xmlns:a="http://schemas.openxmlformats.org/drawingml/2006/main">
-              <a:graphicData uri="http://schemas.openxmlformats.org/drawingml/2006/picture">
-                <pic:pic xmlns:pic="http://schemas.openxmlformats.org/drawingml/2006/picture">
-                  <pic:nvPicPr>
-                    <pic:cNvPr id="5" name="Imagen 5" descr="Gráfico análisis FODA  DAFO profesional corporativo azul (1)"/>
-                    <pic:cNvPicPr>
-                      <a:picLocks noChangeAspect="1"/>
-                    </pic:cNvPicPr>
-                  </pic:nvPicPr>
-                  <pic:blipFill>
-                    <a:blip r:embed="rId14"/>
-                    <a:stretch>
-                      <a:fillRect/>
-                    </a:stretch>
-                  </pic:blipFill>
-                  <pic:spPr>
-                    <a:xfrm>
-                      <a:off x="0" y="0"/>
-                      <a:ext cx="4695190" cy="3521710"/>
-                    </a:xfrm>
-                    <a:prstGeom prst="rect">
-                      <a:avLst/>
-                    </a:prstGeom>
-                  </pic:spPr>
-                </pic:pic>
-              </a:graphicData>
-            </a:graphic>
-          </wp:inline>
-        </w:drawing>
-      </w:r>
-    </w:p>
-    <w:p>
-      <w:pPr>
-        <w:spacing w:line="480" w:lineRule="auto"/>
-        <w:ind w:firstLineChars="127" w:firstLine="306"/>
-        <w:jc w:val="left"/>
-        <w:rPr>
-          <w:rFonts w:asciiTheme="minorHAnsi" w:hAnsiTheme="minorHAnsi" w:cstheme="minorHAnsi"/>
-          <w:b/>
-          <w:bCs/>
-          <w:i/>
-          <w:iCs/>
-          <w:sz w:val="24"/>
-          <w:szCs w:val="24"/>
-        </w:rPr>
-      </w:pPr>
-      <w:r>
-        <w:rPr>
-          <w:rFonts w:asciiTheme="minorHAnsi" w:hAnsiTheme="minorHAnsi" w:cstheme="minorHAnsi"/>
-          <w:b/>
-          <w:bCs/>
-          <w:i/>
-          <w:iCs/>
-          <w:noProof/>
-          <w:sz w:val="24"/>
-          <w:szCs w:val="24"/>
-        </w:rPr>
-        <w:drawing>
-          <wp:inline distT="0" distB="0" distL="114300" distR="114300" wp14:anchorId="72606E75" wp14:editId="787A84D9">
-            <wp:extent cx="4694555" cy="3521075"/>
-            <wp:effectExtent l="0" t="0" r="14605" b="14605"/>
-            <wp:docPr id="4" name="Imagen 4" descr="Gráfica Análisis FODA Ilustrado Rosa"/>
-            <wp:cNvGraphicFramePr>
-              <a:graphicFrameLocks xmlns:a="http://schemas.openxmlformats.org/drawingml/2006/main" noChangeAspect="1"/>
-            </wp:cNvGraphicFramePr>
-            <a:graphic xmlns:a="http://schemas.openxmlformats.org/drawingml/2006/main">
-              <a:graphicData uri="http://schemas.openxmlformats.org/drawingml/2006/picture">
-                <pic:pic xmlns:pic="http://schemas.openxmlformats.org/drawingml/2006/picture">
-                  <pic:nvPicPr>
-                    <pic:cNvPr id="4" name="Imagen 4" descr="Gráfica Análisis FODA Ilustrado Rosa"/>
-                    <pic:cNvPicPr>
-                      <a:picLocks noChangeAspect="1"/>
-                    </pic:cNvPicPr>
-                  </pic:nvPicPr>
-                  <pic:blipFill>
-                    <a:blip r:embed="rId15"/>
-                    <a:stretch>
-                      <a:fillRect/>
-                    </a:stretch>
-                  </pic:blipFill>
-                  <pic:spPr>
-                    <a:xfrm>
-                      <a:off x="0" y="0"/>
-                      <a:ext cx="4694555" cy="3521075"/>
-                    </a:xfrm>
-                    <a:prstGeom prst="rect">
-                      <a:avLst/>
-                    </a:prstGeom>
-                  </pic:spPr>
-                </pic:pic>
-              </a:graphicData>
-            </a:graphic>
-          </wp:inline>
-        </w:drawing>
-      </w:r>
-    </w:p>
     <w:sectPr>
-      <w:headerReference w:type="default" r:id="rId16"/>
-      <w:footerReference w:type="default" r:id="rId17"/>
+      <w:headerReference w:type="default" r:id="rId14"/>
+      <w:footerReference w:type="default" r:id="rId15"/>
       <w:pgSz w:w="11906" w:h="16838"/>
       <w:pgMar w:top="1440" w:right="1800" w:bottom="1440" w:left="1800" w:header="720" w:footer="720" w:gutter="0"/>
       <w:cols w:space="720"/>
@@ -11740,10 +11215,6 @@
 </file>
 
 <file path=customXml/item1.xml><?xml version="1.0" encoding="utf-8"?>
-<b:Sources xmlns:b="http://schemas.openxmlformats.org/officeDocument/2006/bibliography" xmlns="http://schemas.openxmlformats.org/officeDocument/2006/bibliography" SelectedStyle="\APASixthEditionOfficeOnline.xsl" StyleName="APA" Version="6"/>
-</file>
-
-<file path=customXml/item2.xml><?xml version="1.0" encoding="utf-8"?>
 <s:customData xmlns="http://www.wps.cn/officeDocument/2013/wpsCustomData" xmlns:s="http://www.wps.cn/officeDocument/2013/wpsCustomData">
   <customSectProps>
     <customSectPr>
@@ -11757,18 +11228,22 @@
 </s:customData>
 </file>
 
+<file path=customXml/item2.xml><?xml version="1.0" encoding="utf-8"?>
+<b:Sources xmlns:b="http://schemas.openxmlformats.org/officeDocument/2006/bibliography" xmlns="http://schemas.openxmlformats.org/officeDocument/2006/bibliography" SelectedStyle="\APASixthEditionOfficeOnline.xsl" StyleName="APA" Version="6"/>
+</file>
+
 <file path=customXml/itemProps1.xml><?xml version="1.0" encoding="utf-8"?>
+<ds:datastoreItem xmlns:ds="http://schemas.openxmlformats.org/officeDocument/2006/customXml" ds:itemID="{B1977F7D-205B-4081-913C-38D41E755F92}">
+  <ds:schemaRefs>
+    <ds:schemaRef ds:uri="http://www.wps.cn/officeDocument/2013/wpsCustomData"/>
+  </ds:schemaRefs>
+</ds:datastoreItem>
+</file>
+
+<file path=customXml/itemProps2.xml><?xml version="1.0" encoding="utf-8"?>
 <ds:datastoreItem xmlns:ds="http://schemas.openxmlformats.org/officeDocument/2006/customXml" ds:itemID="{6C5F95A5-FBC3-48FD-8FFB-6954C700CD4F}">
   <ds:schemaRefs>
     <ds:schemaRef ds:uri="http://schemas.openxmlformats.org/officeDocument/2006/bibliography"/>
   </ds:schemaRefs>
 </ds:datastoreItem>
-</file>
-
-<file path=customXml/itemProps2.xml><?xml version="1.0" encoding="utf-8"?>
-<ds:datastoreItem xmlns:ds="http://schemas.openxmlformats.org/officeDocument/2006/customXml" ds:itemID="{B1977F7D-205B-4081-913C-38D41E755F92}">
-  <ds:schemaRefs>
-    <ds:schemaRef ds:uri="http://www.wps.cn/officeDocument/2013/wpsCustomData"/>
-  </ds:schemaRefs>
-</ds:datastoreItem>
 </file>
</xml_diff>

<commit_message>
docs(word): modificaciones en archivos
</commit_message>
<xml_diff>
--- a/docs/FAT.docx
+++ b/docs/FAT.docx
@@ -1038,7 +1038,6 @@
               <w:kern w:val="0"/>
               <w:sz w:val="24"/>
               <w:szCs w:val="24"/>
-              <w:highlight w:val="yellow"/>
               <w:lang w:eastAsia="es-AR"/>
             </w:rPr>
           </w:pPr>
@@ -1051,7 +1050,6 @@
                 <w:noProof/>
                 <w:sz w:val="24"/>
                 <w:szCs w:val="24"/>
-                <w:highlight w:val="yellow"/>
               </w:rPr>
               <w:t>ETAPA 4: Mejora del proyecto y refactorización</w:t>
             </w:r>
@@ -1062,7 +1060,6 @@
                 <w:webHidden/>
                 <w:sz w:val="24"/>
                 <w:szCs w:val="24"/>
-                <w:highlight w:val="yellow"/>
               </w:rPr>
               <w:tab/>
             </w:r>
@@ -1073,7 +1070,6 @@
                 <w:webHidden/>
                 <w:sz w:val="24"/>
                 <w:szCs w:val="24"/>
-                <w:highlight w:val="yellow"/>
               </w:rPr>
               <w:fldChar w:fldCharType="begin"/>
             </w:r>
@@ -1084,7 +1080,6 @@
                 <w:webHidden/>
                 <w:sz w:val="24"/>
                 <w:szCs w:val="24"/>
-                <w:highlight w:val="yellow"/>
               </w:rPr>
               <w:instrText xml:space="preserve"> PAGEREF _Toc238628405 \h </w:instrText>
             </w:r>
@@ -1095,7 +1090,6 @@
                 <w:webHidden/>
                 <w:sz w:val="24"/>
                 <w:szCs w:val="24"/>
-                <w:highlight w:val="yellow"/>
               </w:rPr>
             </w:r>
             <w:r>
@@ -1105,7 +1099,6 @@
                 <w:webHidden/>
                 <w:sz w:val="24"/>
                 <w:szCs w:val="24"/>
-                <w:highlight w:val="yellow"/>
               </w:rPr>
               <w:fldChar w:fldCharType="separate"/>
             </w:r>
@@ -1116,7 +1109,6 @@
                 <w:webHidden/>
                 <w:sz w:val="24"/>
                 <w:szCs w:val="24"/>
-                <w:highlight w:val="yellow"/>
               </w:rPr>
               <w:t>14</w:t>
             </w:r>
@@ -1127,7 +1119,6 @@
                 <w:webHidden/>
                 <w:sz w:val="24"/>
                 <w:szCs w:val="24"/>
-                <w:highlight w:val="yellow"/>
               </w:rPr>
               <w:fldChar w:fldCharType="end"/>
             </w:r>
@@ -11215,6 +11206,10 @@
 </file>
 
 <file path=customXml/item1.xml><?xml version="1.0" encoding="utf-8"?>
+<b:Sources xmlns:b="http://schemas.openxmlformats.org/officeDocument/2006/bibliography" xmlns="http://schemas.openxmlformats.org/officeDocument/2006/bibliography" SelectedStyle="\APASixthEditionOfficeOnline.xsl" StyleName="APA" Version="6"/>
+</file>
+
+<file path=customXml/item2.xml><?xml version="1.0" encoding="utf-8"?>
 <s:customData xmlns="http://www.wps.cn/officeDocument/2013/wpsCustomData" xmlns:s="http://www.wps.cn/officeDocument/2013/wpsCustomData">
   <customSectProps>
     <customSectPr>
@@ -11228,22 +11223,18 @@
 </s:customData>
 </file>
 
-<file path=customXml/item2.xml><?xml version="1.0" encoding="utf-8"?>
-<b:Sources xmlns:b="http://schemas.openxmlformats.org/officeDocument/2006/bibliography" xmlns="http://schemas.openxmlformats.org/officeDocument/2006/bibliography" SelectedStyle="\APASixthEditionOfficeOnline.xsl" StyleName="APA" Version="6"/>
+<file path=customXml/itemProps1.xml><?xml version="1.0" encoding="utf-8"?>
+<ds:datastoreItem xmlns:ds="http://schemas.openxmlformats.org/officeDocument/2006/customXml" ds:itemID="{6C5F95A5-FBC3-48FD-8FFB-6954C700CD4F}">
+  <ds:schemaRefs>
+    <ds:schemaRef ds:uri="http://schemas.openxmlformats.org/officeDocument/2006/bibliography"/>
+  </ds:schemaRefs>
+</ds:datastoreItem>
 </file>
 
-<file path=customXml/itemProps1.xml><?xml version="1.0" encoding="utf-8"?>
+<file path=customXml/itemProps2.xml><?xml version="1.0" encoding="utf-8"?>
 <ds:datastoreItem xmlns:ds="http://schemas.openxmlformats.org/officeDocument/2006/customXml" ds:itemID="{B1977F7D-205B-4081-913C-38D41E755F92}">
   <ds:schemaRefs>
     <ds:schemaRef ds:uri="http://www.wps.cn/officeDocument/2013/wpsCustomData"/>
   </ds:schemaRefs>
 </ds:datastoreItem>
-</file>
-
-<file path=customXml/itemProps2.xml><?xml version="1.0" encoding="utf-8"?>
-<ds:datastoreItem xmlns:ds="http://schemas.openxmlformats.org/officeDocument/2006/customXml" ds:itemID="{6C5F95A5-FBC3-48FD-8FFB-6954C700CD4F}">
-  <ds:schemaRefs>
-    <ds:schemaRef ds:uri="http://schemas.openxmlformats.org/officeDocument/2006/bibliography"/>
-  </ds:schemaRefs>
-</ds:datastoreItem>
 </file>
</xml_diff>